<commit_message>
Refatoração do App com FSM
</commit_message>
<xml_diff>
--- a/Documentation and notes.docx
+++ b/Documentation and notes.docx
@@ -23,8 +23,21 @@
           <w:sz w:val="24"/>
           <w:szCs w:val="24"/>
         </w:rPr>
-        <w:t>Documentação e anotações sobre a ferramenta de gestão de Datasets</w:t>
-      </w:r>
+        <w:t xml:space="preserve">Documentação e anotações sobre a ferramenta de gestão de </w:t>
+      </w:r>
+      <w:proofErr w:type="spellStart"/>
+      <w:r>
+        <w:rPr>
+          <w:b/>
+          <w:bCs/>
+          <w:i/>
+          <w:iCs/>
+          <w:sz w:val="24"/>
+          <w:szCs w:val="24"/>
+        </w:rPr>
+        <w:t>Datasets</w:t>
+      </w:r>
+      <w:proofErr w:type="spellEnd"/>
     </w:p>
     <w:p>
       <w:pPr>
@@ -49,6 +62,7 @@
       <w:r>
         <w:t xml:space="preserve">As ferramentas de anotação de dados desempenham são responsáveis por transformar imagens e vídeos “brutos” em </w:t>
       </w:r>
+      <w:proofErr w:type="spellStart"/>
       <w:r>
         <w:rPr>
           <w:i/>
@@ -56,6 +70,7 @@
         </w:rPr>
         <w:t>datasets</w:t>
       </w:r>
+      <w:proofErr w:type="spellEnd"/>
       <w:r>
         <w:t xml:space="preserve"> rotulados que podem ser utilizados no treinamento de modelos de inteligência artificial.</w:t>
       </w:r>
@@ -110,10 +125,34 @@
           <w:b/>
           <w:bCs/>
         </w:rPr>
-        <w:t xml:space="preserve">CVAT (Computer Vision Annotation Tool) - </w:t>
-      </w:r>
-      <w:r>
-        <w:t>plataforma open source cujo principal diferencial é oferecer um ambiente altamente robusto e colaborativo, adequado para projetos grandes e equipes múltiplas.</w:t>
+        <w:t xml:space="preserve">CVAT (Computer Vision </w:t>
+      </w:r>
+      <w:proofErr w:type="spellStart"/>
+      <w:r>
+        <w:rPr>
+          <w:b/>
+          <w:bCs/>
+        </w:rPr>
+        <w:t>Annotation</w:t>
+      </w:r>
+      <w:proofErr w:type="spellEnd"/>
+      <w:r>
+        <w:rPr>
+          <w:b/>
+          <w:bCs/>
+        </w:rPr>
+        <w:t xml:space="preserve"> Tool) - </w:t>
+      </w:r>
+      <w:r>
+        <w:t xml:space="preserve">plataforma open </w:t>
+      </w:r>
+      <w:proofErr w:type="spellStart"/>
+      <w:r>
+        <w:t>source</w:t>
+      </w:r>
+      <w:proofErr w:type="spellEnd"/>
+      <w:r>
+        <w:t xml:space="preserve"> cujo principal diferencial é oferecer um ambiente altamente robusto e colaborativo, adequado para projetos grandes e equipes múltiplas.</w:t>
       </w:r>
     </w:p>
     <w:p>
@@ -187,12 +226,21 @@
           <w:bCs/>
         </w:rPr>
       </w:pPr>
-      <w:r>
-        <w:rPr>
-          <w:b/>
-          <w:bCs/>
-        </w:rPr>
-        <w:t xml:space="preserve">Label Studio </w:t>
+      <w:proofErr w:type="spellStart"/>
+      <w:r>
+        <w:rPr>
+          <w:b/>
+          <w:bCs/>
+        </w:rPr>
+        <w:t>Label</w:t>
+      </w:r>
+      <w:proofErr w:type="spellEnd"/>
+      <w:r>
+        <w:rPr>
+          <w:b/>
+          <w:bCs/>
+        </w:rPr>
+        <w:t xml:space="preserve"> Studio </w:t>
       </w:r>
       <w:r>
         <w:rPr>
@@ -230,7 +278,15 @@
         <w:jc w:val="both"/>
       </w:pPr>
       <w:r>
-        <w:t xml:space="preserve">sua principal característica é a alta customização da interface de anotação. O usuário pode definir layouts personalizados utilizando arquivos de configuração em XML-like syntax. </w:t>
+        <w:t xml:space="preserve">sua principal característica é a alta customização da interface de anotação. O usuário pode definir layouts personalizados utilizando arquivos de configuração em XML-like </w:t>
+      </w:r>
+      <w:proofErr w:type="spellStart"/>
+      <w:r>
+        <w:t>syntax</w:t>
+      </w:r>
+      <w:proofErr w:type="spellEnd"/>
+      <w:r>
+        <w:t xml:space="preserve">. </w:t>
       </w:r>
       <w:r>
         <w:t>Além disso, a</w:t>
@@ -263,6 +319,7 @@
           <w:bCs/>
         </w:rPr>
       </w:pPr>
+      <w:proofErr w:type="spellStart"/>
       <w:r>
         <w:rPr>
           <w:b/>
@@ -284,6 +341,7 @@
         </w:rPr>
         <w:t>g</w:t>
       </w:r>
+      <w:proofErr w:type="spellEnd"/>
       <w:r>
         <w:rPr>
           <w:b/>
@@ -299,7 +357,39 @@
         <w:t xml:space="preserve">– </w:t>
       </w:r>
       <w:r>
-        <w:t>Trata-se de uma ferramenta desktop desenvolvida em Python usando Qt, focada quase exclusivamente em anotação de bounding boxes para detecção de objetos. Diferentemente do CVAT e do Label Studio, o LabelImg não foi pensado como uma plataforma colaborativa nem como um sistema robusto para grandes pipelines de IA. Seu objetivo principal é fornecer uma maneira rápida e leve de criar anotações para datasets menores.</w:t>
+        <w:t xml:space="preserve">Trata-se de uma ferramenta desktop desenvolvida em Python usando Qt, focada quase exclusivamente em anotação de </w:t>
+      </w:r>
+      <w:proofErr w:type="spellStart"/>
+      <w:r>
+        <w:t>bounding</w:t>
+      </w:r>
+      <w:proofErr w:type="spellEnd"/>
+      <w:r>
+        <w:t xml:space="preserve"> boxes para detecção de objetos. Diferentemente do CVAT e do </w:t>
+      </w:r>
+      <w:proofErr w:type="spellStart"/>
+      <w:r>
+        <w:t>Label</w:t>
+      </w:r>
+      <w:proofErr w:type="spellEnd"/>
+      <w:r>
+        <w:t xml:space="preserve"> Studio, o </w:t>
+      </w:r>
+      <w:proofErr w:type="spellStart"/>
+      <w:r>
+        <w:t>LabelImg</w:t>
+      </w:r>
+      <w:proofErr w:type="spellEnd"/>
+      <w:r>
+        <w:t xml:space="preserve"> não foi pensado como uma plataforma colaborativa nem como um sistema robusto para grandes pipelines de IA. Seu objetivo principal é fornecer uma maneira rápida e leve de criar anotações para </w:t>
+      </w:r>
+      <w:proofErr w:type="spellStart"/>
+      <w:r>
+        <w:t>datasets</w:t>
+      </w:r>
+      <w:proofErr w:type="spellEnd"/>
+      <w:r>
+        <w:t xml:space="preserve"> menores.</w:t>
       </w:r>
     </w:p>
     <w:p>
@@ -396,7 +486,39 @@
           <w:i/>
           <w:iCs/>
         </w:rPr>
-        <w:t xml:space="preserve">MVC (Model-View-Controller) </w:t>
+        <w:t>MVC (Model-</w:t>
+      </w:r>
+      <w:proofErr w:type="spellStart"/>
+      <w:r>
+        <w:rPr>
+          <w:i/>
+          <w:iCs/>
+        </w:rPr>
+        <w:t>View</w:t>
+      </w:r>
+      <w:proofErr w:type="spellEnd"/>
+      <w:r>
+        <w:rPr>
+          <w:i/>
+          <w:iCs/>
+        </w:rPr>
+        <w:t>-</w:t>
+      </w:r>
+      <w:proofErr w:type="spellStart"/>
+      <w:r>
+        <w:rPr>
+          <w:i/>
+          <w:iCs/>
+        </w:rPr>
+        <w:t>Controller</w:t>
+      </w:r>
+      <w:proofErr w:type="spellEnd"/>
+      <w:r>
+        <w:rPr>
+          <w:i/>
+          <w:iCs/>
+        </w:rPr>
+        <w:t xml:space="preserve">) </w:t>
       </w:r>
     </w:p>
     <w:p>
@@ -612,7 +734,15 @@
         <w:jc w:val="both"/>
       </w:pPr>
       <w:r>
-        <w:t>Gerenciador da base de dados – responsável pelo armazenamento de imagens e labels, além de implementar sistemas de segurança para evitar inconsistências e duplicações da base de dados.</w:t>
+        <w:t xml:space="preserve">Gerenciador da base de dados – responsável pelo armazenamento de imagens e </w:t>
+      </w:r>
+      <w:proofErr w:type="spellStart"/>
+      <w:r>
+        <w:t>labels</w:t>
+      </w:r>
+      <w:proofErr w:type="spellEnd"/>
+      <w:r>
+        <w:t>, além de implementar sistemas de segurança para evitar inconsistências e duplicações da base de dados.</w:t>
       </w:r>
     </w:p>
     <w:p>
@@ -796,7 +926,29 @@
         <w:rPr>
           <w:lang w:val="en-US"/>
         </w:rPr>
-        <w:t xml:space="preserve">  "image_name": "pain_000123.png",</w:t>
+        <w:t xml:space="preserve">  "</w:t>
+      </w:r>
+      <w:proofErr w:type="spellStart"/>
+      <w:proofErr w:type="gramStart"/>
+      <w:r>
+        <w:rPr>
+          <w:lang w:val="en-US"/>
+        </w:rPr>
+        <w:t>image</w:t>
+      </w:r>
+      <w:proofErr w:type="gramEnd"/>
+      <w:r>
+        <w:rPr>
+          <w:lang w:val="en-US"/>
+        </w:rPr>
+        <w:t>_name</w:t>
+      </w:r>
+      <w:proofErr w:type="spellEnd"/>
+      <w:r>
+        <w:rPr>
+          <w:lang w:val="en-US"/>
+        </w:rPr>
+        <w:t>": "pain_000123.png",</w:t>
       </w:r>
     </w:p>
     <w:p>
@@ -828,7 +980,29 @@
         <w:rPr>
           <w:lang w:val="en-US"/>
         </w:rPr>
-        <w:t xml:space="preserve">  "source_video": "experiment_03.mp4",</w:t>
+        <w:t xml:space="preserve">  "</w:t>
+      </w:r>
+      <w:proofErr w:type="spellStart"/>
+      <w:proofErr w:type="gramStart"/>
+      <w:r>
+        <w:rPr>
+          <w:lang w:val="en-US"/>
+        </w:rPr>
+        <w:t>source</w:t>
+      </w:r>
+      <w:proofErr w:type="gramEnd"/>
+      <w:r>
+        <w:rPr>
+          <w:lang w:val="en-US"/>
+        </w:rPr>
+        <w:t>_video</w:t>
+      </w:r>
+      <w:proofErr w:type="spellEnd"/>
+      <w:r>
+        <w:rPr>
+          <w:lang w:val="en-US"/>
+        </w:rPr>
+        <w:t>": "experiment_03.mp4",</w:t>
       </w:r>
     </w:p>
     <w:p>
@@ -844,7 +1018,29 @@
         <w:rPr>
           <w:lang w:val="en-US"/>
         </w:rPr>
-        <w:t xml:space="preserve">  "frame_number": 4021,</w:t>
+        <w:t xml:space="preserve">  "</w:t>
+      </w:r>
+      <w:proofErr w:type="spellStart"/>
+      <w:proofErr w:type="gramStart"/>
+      <w:r>
+        <w:rPr>
+          <w:lang w:val="en-US"/>
+        </w:rPr>
+        <w:t>frame</w:t>
+      </w:r>
+      <w:proofErr w:type="gramEnd"/>
+      <w:r>
+        <w:rPr>
+          <w:lang w:val="en-US"/>
+        </w:rPr>
+        <w:t>_number</w:t>
+      </w:r>
+      <w:proofErr w:type="spellEnd"/>
+      <w:r>
+        <w:rPr>
+          <w:lang w:val="en-US"/>
+        </w:rPr>
+        <w:t>": 4021,</w:t>
       </w:r>
     </w:p>
     <w:p>
@@ -860,7 +1056,15 @@
         <w:t xml:space="preserve">  </w:t>
       </w:r>
       <w:r>
-        <w:t>"timestamp": 134.03,</w:t>
+        <w:t>"</w:t>
+      </w:r>
+      <w:proofErr w:type="spellStart"/>
+      <w:r>
+        <w:t>timestamp</w:t>
+      </w:r>
+      <w:proofErr w:type="spellEnd"/>
+      <w:r>
+        <w:t>": 134.03,</w:t>
       </w:r>
     </w:p>
     <w:p>
@@ -870,7 +1074,15 @@
         <w:jc w:val="both"/>
       </w:pPr>
       <w:r>
-        <w:t xml:space="preserve">  "roi": [120, 80, 256, 256]</w:t>
+        <w:t xml:space="preserve">  "</w:t>
+      </w:r>
+      <w:proofErr w:type="spellStart"/>
+      <w:r>
+        <w:t>roi</w:t>
+      </w:r>
+      <w:proofErr w:type="spellEnd"/>
+      <w:r>
+        <w:t>": [120, 80, 256, 256]</w:t>
       </w:r>
     </w:p>
     <w:p>
@@ -903,12 +1115,21 @@
           <w:bCs/>
         </w:rPr>
       </w:pPr>
-      <w:r>
-        <w:rPr>
-          <w:b/>
-          <w:bCs/>
-        </w:rPr>
-        <w:t>Threading e Performance</w:t>
+      <w:proofErr w:type="spellStart"/>
+      <w:r>
+        <w:rPr>
+          <w:b/>
+          <w:bCs/>
+        </w:rPr>
+        <w:t>Threading</w:t>
+      </w:r>
+      <w:proofErr w:type="spellEnd"/>
+      <w:r>
+        <w:rPr>
+          <w:b/>
+          <w:bCs/>
+        </w:rPr>
+        <w:t xml:space="preserve"> e Performance</w:t>
       </w:r>
       <w:r>
         <w:rPr>
@@ -939,10 +1160,39 @@
         <w:jc w:val="both"/>
       </w:pPr>
       <w:r>
-        <w:t>Utilização de QThreads ou QRunnable + QThreadPool</w:t>
-      </w:r>
-      <w:r>
-        <w:t xml:space="preserve"> para processar os módulos separadamente, evitando travamentos e lags. A pipeline recomendada de Threads segue:</w:t>
+        <w:t xml:space="preserve">Utilização de </w:t>
+      </w:r>
+      <w:proofErr w:type="spellStart"/>
+      <w:r>
+        <w:t>QThreads</w:t>
+      </w:r>
+      <w:proofErr w:type="spellEnd"/>
+      <w:r>
+        <w:t xml:space="preserve"> ou </w:t>
+      </w:r>
+      <w:proofErr w:type="spellStart"/>
+      <w:r>
+        <w:t>QRunnable</w:t>
+      </w:r>
+      <w:proofErr w:type="spellEnd"/>
+      <w:r>
+        <w:t xml:space="preserve"> + </w:t>
+      </w:r>
+      <w:proofErr w:type="spellStart"/>
+      <w:r>
+        <w:t>QThreadPool</w:t>
+      </w:r>
+      <w:proofErr w:type="spellEnd"/>
+      <w:r>
+        <w:t xml:space="preserve"> para processar os módulos separadamente, evitando travamentos e </w:t>
+      </w:r>
+      <w:proofErr w:type="spellStart"/>
+      <w:r>
+        <w:t>lags</w:t>
+      </w:r>
+      <w:proofErr w:type="spellEnd"/>
+      <w:r>
+        <w:t>. A pipeline recomendada de Threads segue:</w:t>
       </w:r>
     </w:p>
     <w:p>
@@ -1169,15 +1419,57 @@
         </w:rPr>
         <w:t>Fase 1 – MVP (</w:t>
       </w:r>
-      <w:r>
-        <w:rPr>
-          <w:b/>
-          <w:bCs/>
-          <w:i/>
-          <w:iCs/>
-        </w:rPr>
-        <w:t>Minimum Viable Product</w:t>
-      </w:r>
+      <w:proofErr w:type="spellStart"/>
+      <w:r>
+        <w:rPr>
+          <w:b/>
+          <w:bCs/>
+          <w:i/>
+          <w:iCs/>
+        </w:rPr>
+        <w:t>Minimum</w:t>
+      </w:r>
+      <w:proofErr w:type="spellEnd"/>
+      <w:r>
+        <w:rPr>
+          <w:b/>
+          <w:bCs/>
+          <w:i/>
+          <w:iCs/>
+        </w:rPr>
+        <w:t xml:space="preserve"> </w:t>
+      </w:r>
+      <w:proofErr w:type="spellStart"/>
+      <w:r>
+        <w:rPr>
+          <w:b/>
+          <w:bCs/>
+          <w:i/>
+          <w:iCs/>
+        </w:rPr>
+        <w:t>Viable</w:t>
+      </w:r>
+      <w:proofErr w:type="spellEnd"/>
+      <w:r>
+        <w:rPr>
+          <w:b/>
+          <w:bCs/>
+          <w:i/>
+          <w:iCs/>
+        </w:rPr>
+        <w:t xml:space="preserve"> </w:t>
+      </w:r>
+      <w:proofErr w:type="spellStart"/>
+      <w:r>
+        <w:rPr>
+          <w:b/>
+          <w:bCs/>
+          <w:i/>
+          <w:iCs/>
+        </w:rPr>
+        <w:t>Product</w:t>
+      </w:r>
+      <w:proofErr w:type="spellEnd"/>
       <w:r>
         <w:rPr>
           <w:b/>
@@ -1393,12 +1685,21 @@
         </w:rPr>
         <w:t xml:space="preserve">* </w:t>
       </w:r>
-      <w:r>
-        <w:rPr>
-          <w:i/>
-          <w:iCs/>
-        </w:rPr>
-        <w:t xml:space="preserve">OpenCV </w:t>
+      <w:proofErr w:type="spellStart"/>
+      <w:r>
+        <w:rPr>
+          <w:i/>
+          <w:iCs/>
+        </w:rPr>
+        <w:t>OpenCV</w:t>
+      </w:r>
+      <w:proofErr w:type="spellEnd"/>
+      <w:r>
+        <w:rPr>
+          <w:i/>
+          <w:iCs/>
+        </w:rPr>
+        <w:t xml:space="preserve"> </w:t>
       </w:r>
       <w:r>
         <w:rPr>
@@ -1423,7 +1724,23 @@
           <w:i/>
           <w:iCs/>
         </w:rPr>
-        <w:t xml:space="preserve">* Numpy </w:t>
+        <w:t xml:space="preserve">* </w:t>
+      </w:r>
+      <w:proofErr w:type="spellStart"/>
+      <w:r>
+        <w:rPr>
+          <w:i/>
+          <w:iCs/>
+        </w:rPr>
+        <w:t>Numpy</w:t>
+      </w:r>
+      <w:proofErr w:type="spellEnd"/>
+      <w:r>
+        <w:rPr>
+          <w:i/>
+          <w:iCs/>
+        </w:rPr>
+        <w:t xml:space="preserve"> </w:t>
       </w:r>
       <w:r>
         <w:rPr>
@@ -1450,12 +1767,21 @@
         </w:rPr>
         <w:t xml:space="preserve">* </w:t>
       </w:r>
-      <w:r>
-        <w:rPr>
-          <w:i/>
-          <w:iCs/>
-        </w:rPr>
-        <w:t xml:space="preserve">QThread </w:t>
+      <w:proofErr w:type="spellStart"/>
+      <w:r>
+        <w:rPr>
+          <w:i/>
+          <w:iCs/>
+        </w:rPr>
+        <w:t>QThread</w:t>
+      </w:r>
+      <w:proofErr w:type="spellEnd"/>
+      <w:r>
+        <w:rPr>
+          <w:i/>
+          <w:iCs/>
+        </w:rPr>
+        <w:t xml:space="preserve"> </w:t>
       </w:r>
       <w:r>
         <w:rPr>
@@ -1551,25 +1877,7 @@
         <w:rPr>
           <w:color w:val="000000" w:themeColor="text1"/>
         </w:rPr>
-        <w:t>E</w:t>
-      </w:r>
-      <w:r>
-        <w:rPr>
-          <w:color w:val="000000" w:themeColor="text1"/>
-        </w:rPr>
-        <w:t>tapas de</w:t>
-      </w:r>
-      <w:r>
-        <w:rPr>
-          <w:color w:val="000000" w:themeColor="text1"/>
-        </w:rPr>
-        <w:t xml:space="preserve"> desenvolvimento</w:t>
-      </w:r>
-      <w:r>
-        <w:rPr>
-          <w:color w:val="000000" w:themeColor="text1"/>
-        </w:rPr>
-        <w:t xml:space="preserve"> (Notas)</w:t>
+        <w:t>Etapas de desenvolvimento (Notas)</w:t>
       </w:r>
     </w:p>
     <w:p>
@@ -1623,14 +1931,13 @@
           <w:numId w:val="8"/>
         </w:numPr>
       </w:pPr>
+      <w:proofErr w:type="spellStart"/>
       <w:r>
         <w:t>QMainWindow</w:t>
       </w:r>
-      <w:r>
-        <w:t xml:space="preserve"> – </w:t>
-      </w:r>
-      <w:r>
-        <w:t>Janela principal</w:t>
+      <w:proofErr w:type="spellEnd"/>
+      <w:r>
+        <w:t xml:space="preserve"> – Janela principal</w:t>
       </w:r>
     </w:p>
     <w:p>
@@ -1641,18 +1948,14 @@
           <w:numId w:val="8"/>
         </w:numPr>
       </w:pPr>
+      <w:proofErr w:type="spellStart"/>
       <w:r>
         <w:t>QLabel</w:t>
       </w:r>
+      <w:proofErr w:type="spellEnd"/>
       <w:r>
         <w:tab/>
-        <w:t>–</w:t>
-      </w:r>
-      <w:r>
-        <w:t xml:space="preserve"> </w:t>
-      </w:r>
-      <w:r>
-        <w:t>Exibir vídeo</w:t>
+        <w:t>– Exibir vídeo</w:t>
       </w:r>
     </w:p>
     <w:p>
@@ -1663,20 +1966,13 @@
           <w:numId w:val="8"/>
         </w:numPr>
       </w:pPr>
+      <w:proofErr w:type="spellStart"/>
       <w:r>
         <w:t>QPushButton</w:t>
       </w:r>
-      <w:r>
-        <w:t xml:space="preserve"> </w:t>
-      </w:r>
-      <w:r>
-        <w:t>–</w:t>
-      </w:r>
-      <w:r>
-        <w:t xml:space="preserve"> </w:t>
-      </w:r>
-      <w:r>
-        <w:t>Botões</w:t>
+      <w:proofErr w:type="spellEnd"/>
+      <w:r>
+        <w:t xml:space="preserve"> – Botões</w:t>
       </w:r>
     </w:p>
     <w:p>
@@ -1687,14 +1983,13 @@
           <w:numId w:val="8"/>
         </w:numPr>
       </w:pPr>
+      <w:proofErr w:type="spellStart"/>
       <w:r>
         <w:t>QListWidget</w:t>
       </w:r>
-      <w:r>
-        <w:t xml:space="preserve"> </w:t>
-      </w:r>
-      <w:r>
-        <w:t>–</w:t>
+      <w:proofErr w:type="spellEnd"/>
+      <w:r>
+        <w:t xml:space="preserve"> –</w:t>
       </w:r>
       <w:r>
         <w:tab/>
@@ -1709,19 +2004,20 @@
           <w:numId w:val="8"/>
         </w:numPr>
       </w:pPr>
+      <w:proofErr w:type="spellStart"/>
       <w:r>
         <w:t>QSlider</w:t>
       </w:r>
+      <w:proofErr w:type="spellEnd"/>
       <w:r>
         <w:tab/>
-        <w:t>–</w:t>
-      </w:r>
-      <w:r>
-        <w:t xml:space="preserve"> </w:t>
-      </w:r>
+        <w:t xml:space="preserve">– </w:t>
+      </w:r>
+      <w:proofErr w:type="spellStart"/>
       <w:r>
         <w:t>Timeline</w:t>
       </w:r>
+      <w:proofErr w:type="spellEnd"/>
     </w:p>
     <w:p>
       <w:pPr>
@@ -1731,20 +2027,13 @@
           <w:numId w:val="8"/>
         </w:numPr>
       </w:pPr>
+      <w:proofErr w:type="spellStart"/>
       <w:r>
         <w:t>QFileDialog</w:t>
       </w:r>
-      <w:r>
-        <w:t xml:space="preserve"> </w:t>
-      </w:r>
-      <w:r>
-        <w:t>–</w:t>
-      </w:r>
-      <w:r>
-        <w:t xml:space="preserve"> </w:t>
-      </w:r>
-      <w:r>
-        <w:t>Abrir vídeo</w:t>
+      <w:proofErr w:type="spellEnd"/>
+      <w:r>
+        <w:t xml:space="preserve"> – Abrir vídeo</w:t>
       </w:r>
     </w:p>
     <w:p>
@@ -1755,38 +2044,47 @@
           <w:numId w:val="8"/>
         </w:numPr>
       </w:pPr>
-      <w:r>
-        <w:t>QHBoxLayout/VBoxLayout</w:t>
-      </w:r>
-      <w:r>
-        <w:t xml:space="preserve"> </w:t>
-      </w:r>
-      <w:r>
-        <w:t>–</w:t>
-      </w:r>
-      <w:r>
-        <w:t xml:space="preserve"> </w:t>
-      </w:r>
-      <w:r>
-        <w:t>Layouts</w:t>
-      </w:r>
-    </w:p>
-    <w:p>
-      <w:pPr>
-        <w:pStyle w:val="PargrafodaLista"/>
-        <w:rPr>
-          <w:b/>
-          <w:bCs/>
-        </w:rPr>
-      </w:pPr>
-    </w:p>
-    <w:p>
-      <w:pPr>
-        <w:pStyle w:val="PargrafodaLista"/>
-        <w:jc w:val="both"/>
-      </w:pPr>
-      <w:r>
-        <w:t xml:space="preserve">O Qt em Python refere-se ao framework de interface gráfica (GUI) em C++, adaptado para a linguagem Python. Como o Python não possui nativamente componentes complexos para criar janelas, são usados "wrappers" (adaptadores) para conectar o código Python ao motor do Qt. </w:t>
+      <w:proofErr w:type="spellStart"/>
+      <w:r>
+        <w:t>QHBoxLayout</w:t>
+      </w:r>
+      <w:proofErr w:type="spellEnd"/>
+      <w:r>
+        <w:t>/</w:t>
+      </w:r>
+      <w:proofErr w:type="spellStart"/>
+      <w:r>
+        <w:t>VBoxLayout</w:t>
+      </w:r>
+      <w:proofErr w:type="spellEnd"/>
+      <w:r>
+        <w:t xml:space="preserve"> – Layouts</w:t>
+      </w:r>
+    </w:p>
+    <w:p>
+      <w:pPr>
+        <w:pStyle w:val="PargrafodaLista"/>
+        <w:rPr>
+          <w:b/>
+          <w:bCs/>
+        </w:rPr>
+      </w:pPr>
+    </w:p>
+    <w:p>
+      <w:pPr>
+        <w:pStyle w:val="PargrafodaLista"/>
+        <w:jc w:val="both"/>
+      </w:pPr>
+      <w:r>
+        <w:t>O Qt em Python refere-se ao framework de interface gráfica (GUI) em C++, adaptado para a linguagem Python. Como o Python não possui nativamente componentes complexos para criar janelas, são usados "</w:t>
+      </w:r>
+      <w:proofErr w:type="spellStart"/>
+      <w:r>
+        <w:t>wrappers</w:t>
+      </w:r>
+      <w:proofErr w:type="spellEnd"/>
+      <w:r>
+        <w:t xml:space="preserve">" (adaptadores) para conectar o código Python ao motor do Qt. </w:t>
       </w:r>
     </w:p>
     <w:p>
@@ -1829,13 +2127,45 @@
         <w:jc w:val="both"/>
       </w:pPr>
       <w:r>
-        <w:t xml:space="preserve">A arquitetura MVC (Model–View–Controller) é um padrão de organização de software </w:t>
+        <w:t>A arquitetura MVC (Model–</w:t>
+      </w:r>
+      <w:proofErr w:type="spellStart"/>
+      <w:r>
+        <w:t>View</w:t>
+      </w:r>
+      <w:proofErr w:type="spellEnd"/>
+      <w:r>
+        <w:t>–</w:t>
+      </w:r>
+      <w:proofErr w:type="spellStart"/>
+      <w:r>
+        <w:t>Controller</w:t>
+      </w:r>
+      <w:proofErr w:type="spellEnd"/>
+      <w:r>
+        <w:t xml:space="preserve">) é um padrão de organização de software </w:t>
       </w:r>
       <w:r>
         <w:t>utilizado para</w:t>
       </w:r>
       <w:r>
-        <w:t xml:space="preserve"> separar responsabilidades dentro do sistema, tornando o código mais organizado, reutilizável e fácil de manter. Em vez de concentrar toda a lógica em um único lugar, o MVC divide a aplicação em três componentes principais: Model, View e Controller.</w:t>
+        <w:t xml:space="preserve"> separar responsabilidades dentro do sistema, tornando o código mais organizado, reutilizável e fácil de manter. Em vez de concentrar toda a lógica em um único lugar, o MVC divide a aplicação em três componentes principais: Model, </w:t>
+      </w:r>
+      <w:proofErr w:type="spellStart"/>
+      <w:r>
+        <w:t>View</w:t>
+      </w:r>
+      <w:proofErr w:type="spellEnd"/>
+      <w:r>
+        <w:t xml:space="preserve"> e </w:t>
+      </w:r>
+      <w:proofErr w:type="spellStart"/>
+      <w:r>
+        <w:t>Controller</w:t>
+      </w:r>
+      <w:proofErr w:type="spellEnd"/>
+      <w:r>
+        <w:t>.</w:t>
       </w:r>
     </w:p>
     <w:p>
@@ -1900,15 +2230,32 @@
         </w:numPr>
         <w:jc w:val="both"/>
       </w:pPr>
-      <w:r>
-        <w:rPr>
-          <w:b/>
-          <w:bCs/>
-        </w:rPr>
-        <w:t>View (Visão)</w:t>
-      </w:r>
-      <w:r>
-        <w:t xml:space="preserve"> → responsável pela interface e apresentação visual. A View recebe os dados do Model e os organiza de forma compreensível para o usuário.</w:t>
+      <w:proofErr w:type="spellStart"/>
+      <w:r>
+        <w:rPr>
+          <w:b/>
+          <w:bCs/>
+        </w:rPr>
+        <w:t>View</w:t>
+      </w:r>
+      <w:proofErr w:type="spellEnd"/>
+      <w:r>
+        <w:rPr>
+          <w:b/>
+          <w:bCs/>
+        </w:rPr>
+        <w:t xml:space="preserve"> (Visão)</w:t>
+      </w:r>
+      <w:r>
+        <w:t xml:space="preserve"> → responsável pela interface e apresentação visual. A </w:t>
+      </w:r>
+      <w:proofErr w:type="spellStart"/>
+      <w:r>
+        <w:t>View</w:t>
+      </w:r>
+      <w:proofErr w:type="spellEnd"/>
+      <w:r>
+        <w:t xml:space="preserve"> recebe os dados do Model e os organiza de forma compreensível para o usuário.</w:t>
       </w:r>
     </w:p>
     <w:p>
@@ -1927,15 +2274,32 @@
         </w:numPr>
         <w:jc w:val="both"/>
       </w:pPr>
-      <w:r>
-        <w:rPr>
-          <w:b/>
-          <w:bCs/>
-        </w:rPr>
-        <w:t>Controller (Controlador)</w:t>
-      </w:r>
-      <w:r>
-        <w:t xml:space="preserve"> → atua como intermediário entre o usuário, a interface e os dados. Ele recebe as ações realizadas pelo usuário na View, processa essas solicitações e decide qual Model deve ser utilizado.</w:t>
+      <w:proofErr w:type="spellStart"/>
+      <w:r>
+        <w:rPr>
+          <w:b/>
+          <w:bCs/>
+        </w:rPr>
+        <w:t>Controller</w:t>
+      </w:r>
+      <w:proofErr w:type="spellEnd"/>
+      <w:r>
+        <w:rPr>
+          <w:b/>
+          <w:bCs/>
+        </w:rPr>
+        <w:t xml:space="preserve"> (Controlador)</w:t>
+      </w:r>
+      <w:r>
+        <w:t xml:space="preserve"> → atua como intermediário entre o usuário, a interface e os dados. Ele recebe as ações realizadas pelo usuário na </w:t>
+      </w:r>
+      <w:proofErr w:type="spellStart"/>
+      <w:r>
+        <w:t>View</w:t>
+      </w:r>
+      <w:proofErr w:type="spellEnd"/>
+      <w:r>
+        <w:t>, processa essas solicitações e decide qual Model deve ser utilizado.</w:t>
       </w:r>
     </w:p>
     <w:p>
@@ -2083,28 +2447,7 @@
           <w:b/>
           <w:bCs/>
         </w:rPr>
-        <w:t xml:space="preserve">UI (Script </w:t>
-      </w:r>
-      <w:r>
-        <w:rPr>
-          <w:b/>
-          <w:bCs/>
-        </w:rPr>
-        <w:t>Video_Widget</w:t>
-      </w:r>
-      <w:r>
-        <w:rPr>
-          <w:b/>
-          <w:bCs/>
-        </w:rPr>
-        <w:t>.py):</w:t>
-      </w:r>
-      <w:r>
-        <w:rPr>
-          <w:b/>
-          <w:bCs/>
-        </w:rPr>
-        <w:t xml:space="preserve"> </w:t>
+        <w:t xml:space="preserve">UI (Script Video_Widget.py): </w:t>
       </w:r>
       <w:r>
         <w:t>Widget Qt especializado para a e</w:t>
@@ -2200,35 +2543,7 @@
           <w:b/>
           <w:bCs/>
         </w:rPr>
-        <w:t>SERVICES (Script V</w:t>
-      </w:r>
-      <w:r>
-        <w:rPr>
-          <w:b/>
-          <w:bCs/>
-        </w:rPr>
-        <w:t>ideo_</w:t>
-      </w:r>
-      <w:r>
-        <w:rPr>
-          <w:b/>
-          <w:bCs/>
-        </w:rPr>
-        <w:t>M</w:t>
-      </w:r>
-      <w:r>
-        <w:rPr>
-          <w:b/>
-          <w:bCs/>
-        </w:rPr>
-        <w:t>anager.py</w:t>
-      </w:r>
-      <w:r>
-        <w:rPr>
-          <w:b/>
-          <w:bCs/>
-        </w:rPr>
-        <w:t xml:space="preserve">): </w:t>
+        <w:t xml:space="preserve">SERVICES (Script Video_Manager.py): </w:t>
       </w:r>
       <w:r>
         <w:t>Esta camada conté</w:t>
@@ -2250,34 +2565,19 @@
         <w:t xml:space="preserve">Exemplo: </w:t>
       </w:r>
       <w:r>
-        <w:t>abrir vídeo</w:t>
-      </w:r>
-      <w:r>
-        <w:t xml:space="preserve">, </w:t>
-      </w:r>
-      <w:r>
-        <w:t>navegar</w:t>
+        <w:t>abrir vídeo, navegar</w:t>
       </w:r>
       <w:r>
         <w:t xml:space="preserve"> entre</w:t>
       </w:r>
       <w:r>
-        <w:t xml:space="preserve"> frames</w:t>
-      </w:r>
-      <w:r>
-        <w:t xml:space="preserve">, </w:t>
-      </w:r>
-      <w:r>
-        <w:t>controlar posição</w:t>
+        <w:t xml:space="preserve"> frames, controlar posição</w:t>
       </w:r>
       <w:r>
         <w:t xml:space="preserve"> do vídeo</w:t>
       </w:r>
       <w:r>
-        <w:t>,</w:t>
-      </w:r>
-      <w:r>
-        <w:t xml:space="preserve"> ler frames</w:t>
+        <w:t>, ler frames</w:t>
       </w:r>
       <w:r>
         <w:t>,</w:t>
@@ -2307,35 +2607,7 @@
           <w:b/>
           <w:bCs/>
         </w:rPr>
-        <w:t>STORAGE (Script D</w:t>
-      </w:r>
-      <w:r>
-        <w:rPr>
-          <w:b/>
-          <w:bCs/>
-        </w:rPr>
-        <w:t>ataset_</w:t>
-      </w:r>
-      <w:r>
-        <w:rPr>
-          <w:b/>
-          <w:bCs/>
-        </w:rPr>
-        <w:t>M</w:t>
-      </w:r>
-      <w:r>
-        <w:rPr>
-          <w:b/>
-          <w:bCs/>
-        </w:rPr>
-        <w:t>anager.py</w:t>
-      </w:r>
-      <w:r>
-        <w:rPr>
-          <w:b/>
-          <w:bCs/>
-        </w:rPr>
-        <w:t xml:space="preserve">): </w:t>
+        <w:t xml:space="preserve">STORAGE (Script Dataset_Manager.py): </w:t>
       </w:r>
       <w:r>
         <w:t xml:space="preserve">Esta camada </w:t>
@@ -2344,7 +2616,15 @@
         <w:t xml:space="preserve">é responsável pela persistência dos dados, o que inclui funções como a criação e estrutura de pastas, </w:t>
       </w:r>
       <w:r>
-        <w:t>armazenamento dos ROI’s, geração de nome, organização da base, etc.</w:t>
+        <w:t xml:space="preserve">armazenamento dos </w:t>
+      </w:r>
+      <w:proofErr w:type="spellStart"/>
+      <w:r>
+        <w:t>ROI’s</w:t>
+      </w:r>
+      <w:proofErr w:type="spellEnd"/>
+      <w:r>
+        <w:t>, geração de nome, organização da base, etc.</w:t>
       </w:r>
     </w:p>
     <w:p>
@@ -2376,35 +2656,7 @@
           <w:b/>
           <w:bCs/>
         </w:rPr>
-        <w:t>CONTROLLER (Script A</w:t>
-      </w:r>
-      <w:r>
-        <w:rPr>
-          <w:b/>
-          <w:bCs/>
-        </w:rPr>
-        <w:t>pp_</w:t>
-      </w:r>
-      <w:r>
-        <w:rPr>
-          <w:b/>
-          <w:bCs/>
-        </w:rPr>
-        <w:t>C</w:t>
-      </w:r>
-      <w:r>
-        <w:rPr>
-          <w:b/>
-          <w:bCs/>
-        </w:rPr>
-        <w:t>ontroller.py</w:t>
-      </w:r>
-      <w:r>
-        <w:rPr>
-          <w:b/>
-          <w:bCs/>
-        </w:rPr>
-        <w:t xml:space="preserve">): </w:t>
+        <w:t xml:space="preserve">CONTROLLER (Script App_Controller.py): </w:t>
       </w:r>
       <w:r>
         <w:t>Essa camada coordena comunicação entre módulos</w:t>
@@ -2412,6 +2664,46 @@
       <w:r>
         <w:t>, buscando intermediar as operações que incluem serviços, interface e conversões.</w:t>
       </w:r>
+    </w:p>
+    <w:p>
+      <w:pPr>
+        <w:pStyle w:val="PargrafodaLista"/>
+        <w:jc w:val="both"/>
+        <w:rPr>
+          <w:b/>
+          <w:bCs/>
+        </w:rPr>
+      </w:pPr>
+    </w:p>
+    <w:p>
+      <w:pPr>
+        <w:pStyle w:val="PargrafodaLista"/>
+        <w:jc w:val="both"/>
+        <w:rPr>
+          <w:b/>
+          <w:bCs/>
+        </w:rPr>
+      </w:pPr>
+    </w:p>
+    <w:p>
+      <w:pPr>
+        <w:pStyle w:val="PargrafodaLista"/>
+        <w:jc w:val="both"/>
+        <w:rPr>
+          <w:b/>
+          <w:bCs/>
+        </w:rPr>
+      </w:pPr>
+    </w:p>
+    <w:p>
+      <w:pPr>
+        <w:pStyle w:val="PargrafodaLista"/>
+        <w:jc w:val="both"/>
+        <w:rPr>
+          <w:b/>
+          <w:bCs/>
+        </w:rPr>
+      </w:pPr>
     </w:p>
     <w:p>
       <w:pPr>
@@ -2441,8 +2733,961 @@
           <w:b/>
           <w:bCs/>
         </w:rPr>
-        <w:t>S</w:t>
-      </w:r>
+        <w:lastRenderedPageBreak/>
+        <w:t>Lógica da Máquina de Estados Finitos – FSM</w:t>
+      </w:r>
+    </w:p>
+    <w:p>
+      <w:pPr>
+        <w:pStyle w:val="PargrafodaLista"/>
+        <w:jc w:val="both"/>
+        <w:rPr>
+          <w:b/>
+          <w:bCs/>
+        </w:rPr>
+      </w:pPr>
+    </w:p>
+    <w:p>
+      <w:pPr>
+        <w:pStyle w:val="PargrafodaLista"/>
+        <w:jc w:val="both"/>
+      </w:pPr>
+      <w:r>
+        <w:t>A</w:t>
+      </w:r>
+      <w:r>
+        <w:t xml:space="preserve"> </w:t>
+      </w:r>
+      <w:r>
+        <w:rPr>
+          <w:i/>
+          <w:iCs/>
+        </w:rPr>
+        <w:t>Máquina de Estados Finitos</w:t>
+      </w:r>
+      <w:r>
+        <w:t xml:space="preserve"> é um modelo matemático abstrato</w:t>
+      </w:r>
+      <w:r>
+        <w:t>,</w:t>
+      </w:r>
+      <w:r>
+        <w:t xml:space="preserve"> usado para controlar ou representar o comportamento de sistemas sequenciais. O sistema pode estar em apenas um </w:t>
+      </w:r>
+      <w:r>
+        <w:t>estado dentre um número</w:t>
+      </w:r>
+      <w:r>
+        <w:t xml:space="preserve"> finito de estados por vez, migrando entre eles por meio de transições disparadas por eventos ou entradas.</w:t>
+      </w:r>
+    </w:p>
+    <w:p>
+      <w:pPr>
+        <w:pStyle w:val="PargrafodaLista"/>
+        <w:jc w:val="both"/>
+      </w:pPr>
+    </w:p>
+    <w:p>
+      <w:pPr>
+        <w:pStyle w:val="PargrafodaLista"/>
+        <w:numPr>
+          <w:ilvl w:val="0"/>
+          <w:numId w:val="12"/>
+        </w:numPr>
+        <w:jc w:val="both"/>
+        <w:rPr>
+          <w:b/>
+          <w:bCs/>
+        </w:rPr>
+      </w:pPr>
+      <w:r>
+        <w:rPr>
+          <w:b/>
+          <w:bCs/>
+        </w:rPr>
+        <w:t>Elementos da FSM:</w:t>
+      </w:r>
+    </w:p>
+    <w:p>
+      <w:pPr>
+        <w:pStyle w:val="PargrafodaLista"/>
+        <w:ind w:left="1440"/>
+        <w:jc w:val="both"/>
+        <w:rPr>
+          <w:b/>
+          <w:bCs/>
+        </w:rPr>
+      </w:pPr>
+    </w:p>
+    <w:p>
+      <w:pPr>
+        <w:pStyle w:val="PargrafodaLista"/>
+        <w:numPr>
+          <w:ilvl w:val="1"/>
+          <w:numId w:val="12"/>
+        </w:numPr>
+        <w:spacing w:line="276" w:lineRule="auto"/>
+        <w:jc w:val="both"/>
+      </w:pPr>
+      <w:r>
+        <w:rPr>
+          <w:b/>
+          <w:bCs/>
+        </w:rPr>
+        <w:t>Estados:</w:t>
+      </w:r>
+      <w:r>
+        <w:t xml:space="preserve"> Condições ou situações em que o sistema se encontra (</w:t>
+      </w:r>
+      <w:proofErr w:type="spellStart"/>
+      <w:r>
+        <w:t>ex</w:t>
+      </w:r>
+      <w:proofErr w:type="spellEnd"/>
+      <w:r>
+        <w:t>: "Desligado", "Pronto", "Pausado").</w:t>
+      </w:r>
+    </w:p>
+    <w:p>
+      <w:pPr>
+        <w:pStyle w:val="PargrafodaLista"/>
+        <w:numPr>
+          <w:ilvl w:val="1"/>
+          <w:numId w:val="12"/>
+        </w:numPr>
+        <w:spacing w:line="276" w:lineRule="auto"/>
+        <w:jc w:val="both"/>
+      </w:pPr>
+      <w:r>
+        <w:rPr>
+          <w:b/>
+          <w:bCs/>
+        </w:rPr>
+        <w:t>Transições:</w:t>
+      </w:r>
+      <w:r>
+        <w:t xml:space="preserve"> Os caminhos ou regras que determinam a mudança de um estado para outro, geralmente provocados por um evento ou estímulo de entrada.</w:t>
+      </w:r>
+    </w:p>
+    <w:p>
+      <w:pPr>
+        <w:pStyle w:val="PargrafodaLista"/>
+        <w:numPr>
+          <w:ilvl w:val="1"/>
+          <w:numId w:val="12"/>
+        </w:numPr>
+        <w:spacing w:line="276" w:lineRule="auto"/>
+        <w:jc w:val="both"/>
+      </w:pPr>
+      <w:r>
+        <w:rPr>
+          <w:b/>
+          <w:bCs/>
+        </w:rPr>
+        <w:t>Ações/Saídas:</w:t>
+      </w:r>
+      <w:r>
+        <w:t xml:space="preserve"> As respostas ou comportamentos gerados pelo sistema</w:t>
+      </w:r>
+    </w:p>
+    <w:p>
+      <w:pPr>
+        <w:pStyle w:val="PargrafodaLista"/>
+        <w:spacing w:line="276" w:lineRule="auto"/>
+        <w:ind w:left="1440"/>
+        <w:jc w:val="both"/>
+      </w:pPr>
+    </w:p>
+    <w:p>
+      <w:pPr>
+        <w:pStyle w:val="PargrafodaLista"/>
+        <w:numPr>
+          <w:ilvl w:val="0"/>
+          <w:numId w:val="12"/>
+        </w:numPr>
+        <w:spacing w:line="276" w:lineRule="auto"/>
+        <w:jc w:val="both"/>
+        <w:rPr>
+          <w:b/>
+          <w:bCs/>
+        </w:rPr>
+      </w:pPr>
+      <w:r>
+        <w:rPr>
+          <w:b/>
+          <w:bCs/>
+        </w:rPr>
+        <w:t>Principais Modelos</w:t>
+      </w:r>
+      <w:r>
+        <w:rPr>
+          <w:b/>
+          <w:bCs/>
+        </w:rPr>
+        <w:t>:</w:t>
+      </w:r>
+    </w:p>
+    <w:p>
+      <w:pPr>
+        <w:pStyle w:val="PargrafodaLista"/>
+        <w:spacing w:line="276" w:lineRule="auto"/>
+        <w:ind w:left="1440"/>
+        <w:jc w:val="both"/>
+        <w:rPr>
+          <w:b/>
+          <w:bCs/>
+        </w:rPr>
+      </w:pPr>
+    </w:p>
+    <w:p>
+      <w:pPr>
+        <w:pStyle w:val="PargrafodaLista"/>
+        <w:numPr>
+          <w:ilvl w:val="1"/>
+          <w:numId w:val="12"/>
+        </w:numPr>
+        <w:spacing w:line="276" w:lineRule="auto"/>
+        <w:jc w:val="both"/>
+      </w:pPr>
+      <w:r>
+        <w:rPr>
+          <w:b/>
+          <w:bCs/>
+        </w:rPr>
+        <w:t>Máquina de Moore:</w:t>
+      </w:r>
+      <w:r>
+        <w:t xml:space="preserve"> O valor da saída depende exclusivamente do estado atual da máquina.</w:t>
+      </w:r>
+    </w:p>
+    <w:p>
+      <w:pPr>
+        <w:pStyle w:val="PargrafodaLista"/>
+        <w:numPr>
+          <w:ilvl w:val="1"/>
+          <w:numId w:val="12"/>
+        </w:numPr>
+        <w:spacing w:line="276" w:lineRule="auto"/>
+        <w:jc w:val="both"/>
+      </w:pPr>
+      <w:r>
+        <w:rPr>
+          <w:b/>
+          <w:bCs/>
+        </w:rPr>
+        <w:t xml:space="preserve">Máquina de </w:t>
+      </w:r>
+      <w:proofErr w:type="spellStart"/>
+      <w:r>
+        <w:rPr>
+          <w:b/>
+          <w:bCs/>
+        </w:rPr>
+        <w:t>Mealy</w:t>
+      </w:r>
+      <w:proofErr w:type="spellEnd"/>
+      <w:r>
+        <w:rPr>
+          <w:b/>
+          <w:bCs/>
+        </w:rPr>
+        <w:t>:</w:t>
+      </w:r>
+      <w:r>
+        <w:t xml:space="preserve"> O valor da saída depende tanto do estado atual quanto das entradas</w:t>
+      </w:r>
+      <w:r>
+        <w:t>.</w:t>
+      </w:r>
+    </w:p>
+    <w:p>
+      <w:pPr>
+        <w:spacing w:line="276" w:lineRule="auto"/>
+        <w:ind w:left="708"/>
+        <w:jc w:val="both"/>
+        <w:rPr>
+          <w:b/>
+          <w:bCs/>
+          <w:i/>
+          <w:iCs/>
+          <w:u w:val="single"/>
+        </w:rPr>
+      </w:pPr>
+      <w:r>
+        <w:rPr>
+          <w:b/>
+          <w:bCs/>
+          <w:i/>
+          <w:iCs/>
+          <w:u w:val="single"/>
+        </w:rPr>
+        <w:t>Implementação da FSM para o projeto:</w:t>
+      </w:r>
+    </w:p>
+    <w:p>
+      <w:pPr>
+        <w:spacing w:line="276" w:lineRule="auto"/>
+        <w:ind w:left="708"/>
+        <w:jc w:val="both"/>
+      </w:pPr>
+      <w:r>
+        <w:t xml:space="preserve">Exemplo de estados existentes atualmente no projeto que estão </w:t>
+      </w:r>
+      <w:r>
+        <w:t xml:space="preserve">espalhados por vários </w:t>
+      </w:r>
+      <w:proofErr w:type="spellStart"/>
+      <w:r>
+        <w:rPr>
+          <w:i/>
+          <w:iCs/>
+        </w:rPr>
+        <w:t>ifs</w:t>
+      </w:r>
+      <w:proofErr w:type="spellEnd"/>
+      <w:r>
+        <w:t xml:space="preserve">, </w:t>
+      </w:r>
+      <w:proofErr w:type="spellStart"/>
+      <w:r>
+        <w:rPr>
+          <w:i/>
+          <w:iCs/>
+        </w:rPr>
+        <w:t>timers</w:t>
+      </w:r>
+      <w:proofErr w:type="spellEnd"/>
+      <w:r>
+        <w:t xml:space="preserve"> e </w:t>
+      </w:r>
+      <w:r>
+        <w:rPr>
+          <w:i/>
+          <w:iCs/>
+        </w:rPr>
+        <w:t>call-backs</w:t>
+      </w:r>
+      <w:r>
+        <w:t xml:space="preserve">: </w:t>
+      </w:r>
+      <w:proofErr w:type="spellStart"/>
+      <w:r>
+        <w:rPr>
+          <w:i/>
+          <w:iCs/>
+        </w:rPr>
+        <w:t>Dataset</w:t>
+      </w:r>
+      <w:proofErr w:type="spellEnd"/>
+      <w:r>
+        <w:t xml:space="preserve"> aberto, Vídeo carregado, Vídeo em reprodução, Usuário navegando pelo </w:t>
+      </w:r>
+      <w:proofErr w:type="spellStart"/>
+      <w:r>
+        <w:rPr>
+          <w:i/>
+          <w:iCs/>
+        </w:rPr>
+        <w:t>slider</w:t>
+      </w:r>
+      <w:proofErr w:type="spellEnd"/>
+      <w:r>
+        <w:rPr>
+          <w:i/>
+          <w:iCs/>
+        </w:rPr>
+        <w:t xml:space="preserve">, </w:t>
+      </w:r>
+      <w:r>
+        <w:t>etc.</w:t>
+      </w:r>
+    </w:p>
+    <w:p>
+      <w:pPr>
+        <w:pStyle w:val="PargrafodaLista"/>
+        <w:jc w:val="both"/>
+      </w:pPr>
+      <w:r>
+        <w:t xml:space="preserve">Recomendação: </w:t>
+      </w:r>
+      <w:r>
+        <w:t xml:space="preserve">não </w:t>
+      </w:r>
+      <w:r>
+        <w:t>criar</w:t>
+      </w:r>
+      <w:r>
+        <w:t xml:space="preserve"> uma FSM para o projeto inteiro</w:t>
+      </w:r>
+      <w:r>
+        <w:t xml:space="preserve">, mas sim, duas </w:t>
+      </w:r>
+      <w:proofErr w:type="spellStart"/>
+      <w:r>
+        <w:t>FSMs</w:t>
+      </w:r>
+      <w:proofErr w:type="spellEnd"/>
+      <w:r>
+        <w:t xml:space="preserve"> independentes para o controle da aplicação e para o controle do vídeo.</w:t>
+      </w:r>
+      <w:r>
+        <w:t xml:space="preserve"> Dessa forma é possível definir claramente as funcionalidades específicas do projeto e do player.</w:t>
+      </w:r>
+    </w:p>
+    <w:p>
+      <w:pPr>
+        <w:pStyle w:val="PargrafodaLista"/>
+        <w:ind w:left="1440"/>
+        <w:jc w:val="both"/>
+      </w:pPr>
+    </w:p>
+    <w:p>
+      <w:pPr>
+        <w:pStyle w:val="PargrafodaLista"/>
+        <w:numPr>
+          <w:ilvl w:val="0"/>
+          <w:numId w:val="14"/>
+        </w:numPr>
+        <w:jc w:val="both"/>
+      </w:pPr>
+      <w:proofErr w:type="spellStart"/>
+      <w:r>
+        <w:rPr>
+          <w:b/>
+          <w:bCs/>
+        </w:rPr>
+        <w:t>Application</w:t>
+      </w:r>
+      <w:proofErr w:type="spellEnd"/>
+      <w:r>
+        <w:rPr>
+          <w:b/>
+          <w:bCs/>
+        </w:rPr>
+        <w:t xml:space="preserve"> FSM</w:t>
+      </w:r>
+      <w:r>
+        <w:rPr>
+          <w:b/>
+          <w:bCs/>
+        </w:rPr>
+        <w:t xml:space="preserve"> - </w:t>
+      </w:r>
+      <w:r>
+        <w:t>Responsável por responder perguntas como:</w:t>
+      </w:r>
+      <w:r>
+        <w:t xml:space="preserve"> </w:t>
+      </w:r>
+      <w:r>
+        <w:t>“Existe um projeto carregado?”, “Existe um vídeo aberto?”, “Podemos salvar uma ROI?”, etc.</w:t>
+      </w:r>
+    </w:p>
+    <w:p>
+      <w:pPr>
+        <w:pStyle w:val="PargrafodaLista"/>
+        <w:numPr>
+          <w:ilvl w:val="1"/>
+          <w:numId w:val="14"/>
+        </w:numPr>
+        <w:jc w:val="both"/>
+        <w:rPr>
+          <w:i/>
+          <w:iCs/>
+          <w:u w:val="single"/>
+        </w:rPr>
+      </w:pPr>
+      <w:r>
+        <w:rPr>
+          <w:i/>
+          <w:iCs/>
+          <w:u w:val="single"/>
+        </w:rPr>
+        <w:t>ESTADOS:</w:t>
+      </w:r>
+    </w:p>
+    <w:p>
+      <w:pPr>
+        <w:pStyle w:val="PargrafodaLista"/>
+        <w:numPr>
+          <w:ilvl w:val="2"/>
+          <w:numId w:val="14"/>
+        </w:numPr>
+        <w:jc w:val="both"/>
+      </w:pPr>
+      <w:proofErr w:type="spellStart"/>
+      <w:r>
+        <w:t>Initial</w:t>
+      </w:r>
+      <w:proofErr w:type="spellEnd"/>
+    </w:p>
+    <w:p>
+      <w:pPr>
+        <w:pStyle w:val="PargrafodaLista"/>
+        <w:numPr>
+          <w:ilvl w:val="2"/>
+          <w:numId w:val="14"/>
+        </w:numPr>
+        <w:jc w:val="both"/>
+      </w:pPr>
+      <w:proofErr w:type="spellStart"/>
+      <w:r>
+        <w:t>Dataset_Ready</w:t>
+      </w:r>
+      <w:proofErr w:type="spellEnd"/>
+    </w:p>
+    <w:p>
+      <w:pPr>
+        <w:pStyle w:val="PargrafodaLista"/>
+        <w:numPr>
+          <w:ilvl w:val="2"/>
+          <w:numId w:val="14"/>
+        </w:numPr>
+        <w:jc w:val="both"/>
+      </w:pPr>
+      <w:proofErr w:type="spellStart"/>
+      <w:r>
+        <w:t>Video_Loaded</w:t>
+      </w:r>
+      <w:proofErr w:type="spellEnd"/>
+    </w:p>
+    <w:p>
+      <w:pPr>
+        <w:pStyle w:val="PargrafodaLista"/>
+        <w:numPr>
+          <w:ilvl w:val="2"/>
+          <w:numId w:val="14"/>
+        </w:numPr>
+        <w:jc w:val="both"/>
+      </w:pPr>
+      <w:proofErr w:type="spellStart"/>
+      <w:r>
+        <w:t>Ready_to_Annotate</w:t>
+      </w:r>
+      <w:proofErr w:type="spellEnd"/>
+    </w:p>
+    <w:p>
+      <w:pPr>
+        <w:pStyle w:val="PargrafodaLista"/>
+        <w:ind w:left="2160"/>
+        <w:jc w:val="both"/>
+      </w:pPr>
+    </w:p>
+    <w:p>
+      <w:pPr>
+        <w:pStyle w:val="PargrafodaLista"/>
+        <w:numPr>
+          <w:ilvl w:val="0"/>
+          <w:numId w:val="14"/>
+        </w:numPr>
+        <w:jc w:val="both"/>
+        <w:rPr>
+          <w:b/>
+          <w:bCs/>
+        </w:rPr>
+      </w:pPr>
+      <w:proofErr w:type="spellStart"/>
+      <w:r>
+        <w:rPr>
+          <w:b/>
+          <w:bCs/>
+        </w:rPr>
+        <w:t>Video</w:t>
+      </w:r>
+      <w:proofErr w:type="spellEnd"/>
+      <w:r>
+        <w:rPr>
+          <w:b/>
+          <w:bCs/>
+        </w:rPr>
+        <w:t xml:space="preserve"> FSM</w:t>
+      </w:r>
+      <w:r>
+        <w:rPr>
+          <w:b/>
+          <w:bCs/>
+        </w:rPr>
+        <w:t xml:space="preserve"> - </w:t>
+      </w:r>
+      <w:r>
+        <w:t>Responsável apenas pelo player.</w:t>
+      </w:r>
+    </w:p>
+    <w:p>
+      <w:pPr>
+        <w:pStyle w:val="PargrafodaLista"/>
+        <w:numPr>
+          <w:ilvl w:val="1"/>
+          <w:numId w:val="14"/>
+        </w:numPr>
+        <w:jc w:val="both"/>
+        <w:rPr>
+          <w:i/>
+          <w:iCs/>
+          <w:u w:val="single"/>
+        </w:rPr>
+      </w:pPr>
+      <w:r>
+        <w:rPr>
+          <w:i/>
+          <w:iCs/>
+          <w:u w:val="single"/>
+        </w:rPr>
+        <w:t>ESTADOS:</w:t>
+      </w:r>
+    </w:p>
+    <w:p>
+      <w:pPr>
+        <w:pStyle w:val="PargrafodaLista"/>
+        <w:numPr>
+          <w:ilvl w:val="2"/>
+          <w:numId w:val="14"/>
+        </w:numPr>
+        <w:jc w:val="both"/>
+      </w:pPr>
+      <w:proofErr w:type="spellStart"/>
+      <w:r>
+        <w:t>Stopped</w:t>
+      </w:r>
+      <w:proofErr w:type="spellEnd"/>
+    </w:p>
+    <w:p>
+      <w:pPr>
+        <w:pStyle w:val="PargrafodaLista"/>
+        <w:numPr>
+          <w:ilvl w:val="2"/>
+          <w:numId w:val="14"/>
+        </w:numPr>
+        <w:jc w:val="both"/>
+      </w:pPr>
+      <w:proofErr w:type="spellStart"/>
+      <w:r>
+        <w:t>Playing</w:t>
+      </w:r>
+      <w:proofErr w:type="spellEnd"/>
+    </w:p>
+    <w:p>
+      <w:pPr>
+        <w:pStyle w:val="PargrafodaLista"/>
+        <w:numPr>
+          <w:ilvl w:val="2"/>
+          <w:numId w:val="14"/>
+        </w:numPr>
+        <w:jc w:val="both"/>
+      </w:pPr>
+      <w:proofErr w:type="spellStart"/>
+      <w:r>
+        <w:t>Paused</w:t>
+      </w:r>
+      <w:proofErr w:type="spellEnd"/>
+    </w:p>
+    <w:p>
+      <w:pPr>
+        <w:pStyle w:val="PargrafodaLista"/>
+        <w:numPr>
+          <w:ilvl w:val="2"/>
+          <w:numId w:val="14"/>
+        </w:numPr>
+        <w:jc w:val="both"/>
+      </w:pPr>
+      <w:proofErr w:type="spellStart"/>
+      <w:r>
+        <w:t>Seeking</w:t>
+      </w:r>
+      <w:proofErr w:type="spellEnd"/>
+    </w:p>
+    <w:p>
+      <w:pPr>
+        <w:pStyle w:val="PargrafodaLista"/>
+        <w:numPr>
+          <w:ilvl w:val="0"/>
+          <w:numId w:val="14"/>
+        </w:numPr>
+        <w:jc w:val="both"/>
+        <w:rPr>
+          <w:b/>
+          <w:bCs/>
+        </w:rPr>
+      </w:pPr>
+      <w:r>
+        <w:rPr>
+          <w:b/>
+          <w:bCs/>
+        </w:rPr>
+        <w:lastRenderedPageBreak/>
+        <w:t>Nova estrutura sugerida:</w:t>
+      </w:r>
+    </w:p>
+    <w:p>
+      <w:pPr>
+        <w:pStyle w:val="PargrafodaLista"/>
+        <w:ind w:left="1440"/>
+        <w:jc w:val="both"/>
+        <w:rPr>
+          <w:b/>
+          <w:bCs/>
+        </w:rPr>
+      </w:pPr>
+      <w:r>
+        <w:rPr>
+          <w:b/>
+          <w:bCs/>
+          <w:noProof/>
+        </w:rPr>
+        <w:drawing>
+          <wp:inline distT="0" distB="0" distL="0" distR="0" wp14:anchorId="3DAC1388" wp14:editId="392126A6">
+            <wp:extent cx="3942230" cy="1621569"/>
+            <wp:effectExtent l="0" t="0" r="1270" b="0"/>
+            <wp:docPr id="980121714" name="Imagem 1"/>
+            <wp:cNvGraphicFramePr>
+              <a:graphicFrameLocks xmlns:a="http://schemas.openxmlformats.org/drawingml/2006/main" noChangeAspect="1"/>
+            </wp:cNvGraphicFramePr>
+            <a:graphic xmlns:a="http://schemas.openxmlformats.org/drawingml/2006/main">
+              <a:graphicData uri="http://schemas.openxmlformats.org/drawingml/2006/picture">
+                <pic:pic xmlns:pic="http://schemas.openxmlformats.org/drawingml/2006/picture">
+                  <pic:nvPicPr>
+                    <pic:cNvPr id="980121714" name=""/>
+                    <pic:cNvPicPr/>
+                  </pic:nvPicPr>
+                  <pic:blipFill rotWithShape="1">
+                    <a:blip r:embed="rId8"/>
+                    <a:srcRect t="3002" b="58730"/>
+                    <a:stretch>
+                      <a:fillRect/>
+                    </a:stretch>
+                  </pic:blipFill>
+                  <pic:spPr bwMode="auto">
+                    <a:xfrm>
+                      <a:off x="0" y="0"/>
+                      <a:ext cx="3943900" cy="1622256"/>
+                    </a:xfrm>
+                    <a:prstGeom prst="rect">
+                      <a:avLst/>
+                    </a:prstGeom>
+                    <a:ln>
+                      <a:noFill/>
+                    </a:ln>
+                    <a:extLst>
+                      <a:ext uri="{53640926-AAD7-44D8-BBD7-CCE9431645EC}">
+                        <a14:shadowObscured xmlns:a14="http://schemas.microsoft.com/office/drawing/2010/main"/>
+                      </a:ext>
+                    </a:extLst>
+                  </pic:spPr>
+                </pic:pic>
+              </a:graphicData>
+            </a:graphic>
+          </wp:inline>
+        </w:drawing>
+      </w:r>
+    </w:p>
+    <w:p>
+      <w:pPr>
+        <w:pStyle w:val="PargrafodaLista"/>
+        <w:ind w:left="1440"/>
+        <w:jc w:val="both"/>
+        <w:rPr>
+          <w:b/>
+          <w:bCs/>
+        </w:rPr>
+      </w:pPr>
+      <w:r>
+        <w:rPr>
+          <w:b/>
+          <w:bCs/>
+          <w:noProof/>
+        </w:rPr>
+        <w:drawing>
+          <wp:inline distT="0" distB="0" distL="0" distR="0" wp14:anchorId="11C8FFC3" wp14:editId="7E00978D">
+            <wp:extent cx="3943349" cy="1447717"/>
+            <wp:effectExtent l="0" t="0" r="635" b="635"/>
+            <wp:docPr id="310346590" name="Imagem 1"/>
+            <wp:cNvGraphicFramePr>
+              <a:graphicFrameLocks xmlns:a="http://schemas.openxmlformats.org/drawingml/2006/main" noChangeAspect="1"/>
+            </wp:cNvGraphicFramePr>
+            <a:graphic xmlns:a="http://schemas.openxmlformats.org/drawingml/2006/main">
+              <a:graphicData uri="http://schemas.openxmlformats.org/drawingml/2006/picture">
+                <pic:pic xmlns:pic="http://schemas.openxmlformats.org/drawingml/2006/picture">
+                  <pic:nvPicPr>
+                    <pic:cNvPr id="310346590" name=""/>
+                    <pic:cNvPicPr/>
+                  </pic:nvPicPr>
+                  <pic:blipFill rotWithShape="1">
+                    <a:blip r:embed="rId8"/>
+                    <a:srcRect t="65845"/>
+                    <a:stretch>
+                      <a:fillRect/>
+                    </a:stretch>
+                  </pic:blipFill>
+                  <pic:spPr bwMode="auto">
+                    <a:xfrm>
+                      <a:off x="0" y="0"/>
+                      <a:ext cx="3943900" cy="1447919"/>
+                    </a:xfrm>
+                    <a:prstGeom prst="rect">
+                      <a:avLst/>
+                    </a:prstGeom>
+                    <a:ln>
+                      <a:noFill/>
+                    </a:ln>
+                    <a:extLst>
+                      <a:ext uri="{53640926-AAD7-44D8-BBD7-CCE9431645EC}">
+                        <a14:shadowObscured xmlns:a14="http://schemas.microsoft.com/office/drawing/2010/main"/>
+                      </a:ext>
+                    </a:extLst>
+                  </pic:spPr>
+                </pic:pic>
+              </a:graphicData>
+            </a:graphic>
+          </wp:inline>
+        </w:drawing>
+      </w:r>
+    </w:p>
+    <w:p>
+      <w:pPr>
+        <w:pStyle w:val="PargrafodaLista"/>
+        <w:ind w:left="1440"/>
+        <w:jc w:val="both"/>
+        <w:rPr>
+          <w:b/>
+          <w:bCs/>
+        </w:rPr>
+      </w:pPr>
+      <w:r>
+        <w:rPr>
+          <w:b/>
+          <w:bCs/>
+        </w:rPr>
+        <w:drawing>
+          <wp:inline distT="0" distB="0" distL="0" distR="0" wp14:anchorId="1124023A" wp14:editId="526B5340">
+            <wp:extent cx="3942080" cy="3680890"/>
+            <wp:effectExtent l="0" t="0" r="1270" b="0"/>
+            <wp:docPr id="943735717" name="Imagem 1"/>
+            <wp:cNvGraphicFramePr>
+              <a:graphicFrameLocks xmlns:a="http://schemas.openxmlformats.org/drawingml/2006/main" noChangeAspect="1"/>
+            </wp:cNvGraphicFramePr>
+            <a:graphic xmlns:a="http://schemas.openxmlformats.org/drawingml/2006/main">
+              <a:graphicData uri="http://schemas.openxmlformats.org/drawingml/2006/picture">
+                <pic:pic xmlns:pic="http://schemas.openxmlformats.org/drawingml/2006/picture">
+                  <pic:nvPicPr>
+                    <pic:cNvPr id="943735717" name=""/>
+                    <pic:cNvPicPr/>
+                  </pic:nvPicPr>
+                  <pic:blipFill rotWithShape="1">
+                    <a:blip r:embed="rId9"/>
+                    <a:srcRect r="26580"/>
+                    <a:stretch>
+                      <a:fillRect/>
+                    </a:stretch>
+                  </pic:blipFill>
+                  <pic:spPr bwMode="auto">
+                    <a:xfrm>
+                      <a:off x="0" y="0"/>
+                      <a:ext cx="3960545" cy="3698132"/>
+                    </a:xfrm>
+                    <a:prstGeom prst="rect">
+                      <a:avLst/>
+                    </a:prstGeom>
+                    <a:ln>
+                      <a:noFill/>
+                    </a:ln>
+                    <a:extLst>
+                      <a:ext uri="{53640926-AAD7-44D8-BBD7-CCE9431645EC}">
+                        <a14:shadowObscured xmlns:a14="http://schemas.microsoft.com/office/drawing/2010/main"/>
+                      </a:ext>
+                    </a:extLst>
+                  </pic:spPr>
+                </pic:pic>
+              </a:graphicData>
+            </a:graphic>
+          </wp:inline>
+        </w:drawing>
+      </w:r>
+    </w:p>
+    <w:p>
+      <w:pPr>
+        <w:pStyle w:val="PargrafodaLista"/>
+        <w:ind w:left="1440"/>
+        <w:jc w:val="both"/>
+        <w:rPr>
+          <w:b/>
+          <w:bCs/>
+        </w:rPr>
+      </w:pPr>
+    </w:p>
+    <w:p>
+      <w:pPr>
+        <w:pStyle w:val="PargrafodaLista"/>
+        <w:numPr>
+          <w:ilvl w:val="0"/>
+          <w:numId w:val="14"/>
+        </w:numPr>
+        <w:jc w:val="both"/>
+      </w:pPr>
+      <w:r>
+        <w:t xml:space="preserve">A </w:t>
+      </w:r>
+      <w:proofErr w:type="spellStart"/>
+      <w:r>
+        <w:rPr>
+          <w:i/>
+          <w:iCs/>
+        </w:rPr>
+        <w:t>MainWindow</w:t>
+      </w:r>
+      <w:proofErr w:type="spellEnd"/>
+      <w:r>
+        <w:t xml:space="preserve"> deixa de "fazer coisas"</w:t>
+      </w:r>
+      <w:r>
+        <w:t xml:space="preserve"> e apenas informa os estados, de modo que o </w:t>
+      </w:r>
+      <w:proofErr w:type="spellStart"/>
+      <w:r>
+        <w:rPr>
+          <w:i/>
+          <w:iCs/>
+        </w:rPr>
+        <w:t>ApplicationController</w:t>
+      </w:r>
+      <w:proofErr w:type="spellEnd"/>
+      <w:r>
+        <w:t xml:space="preserve"> fica responsável por decidir o que deve ser feito</w:t>
+      </w:r>
+    </w:p>
+    <w:p>
+      <w:pPr>
+        <w:pStyle w:val="PargrafodaLista"/>
+        <w:ind w:left="2160"/>
+        <w:jc w:val="both"/>
+        <w:rPr>
+          <w:b/>
+          <w:bCs/>
+        </w:rPr>
+      </w:pPr>
+    </w:p>
+    <w:p>
+      <w:pPr>
+        <w:pStyle w:val="PargrafodaLista"/>
+        <w:jc w:val="both"/>
+        <w:rPr>
+          <w:b/>
+          <w:bCs/>
+        </w:rPr>
+      </w:pPr>
+    </w:p>
+    <w:p>
+      <w:pPr>
+        <w:pStyle w:val="PargrafodaLista"/>
+        <w:numPr>
+          <w:ilvl w:val="0"/>
+          <w:numId w:val="6"/>
+        </w:numPr>
+        <w:jc w:val="both"/>
+        <w:rPr>
+          <w:b/>
+          <w:bCs/>
+        </w:rPr>
+      </w:pPr>
     </w:p>
     <w:p>
       <w:pPr>
@@ -2807,6 +4052,119 @@
     </w:lvl>
   </w:abstractNum>
   <w:abstractNum w:abstractNumId="3" w15:restartNumberingAfterBreak="0">
+    <w:nsid w:val="1CE06FE8"/>
+    <w:multiLevelType w:val="hybridMultilevel"/>
+    <w:tmpl w:val="C4A223BA"/>
+    <w:lvl w:ilvl="0" w:tplc="04160001">
+      <w:start w:val="1"/>
+      <w:numFmt w:val="bullet"/>
+      <w:lvlText w:val=""/>
+      <w:lvlJc w:val="left"/>
+      <w:pPr>
+        <w:ind w:left="1428" w:hanging="360"/>
+      </w:pPr>
+      <w:rPr>
+        <w:rFonts w:ascii="Symbol" w:hAnsi="Symbol" w:hint="default"/>
+      </w:rPr>
+    </w:lvl>
+    <w:lvl w:ilvl="1" w:tplc="04160003" w:tentative="1">
+      <w:start w:val="1"/>
+      <w:numFmt w:val="bullet"/>
+      <w:lvlText w:val="o"/>
+      <w:lvlJc w:val="left"/>
+      <w:pPr>
+        <w:ind w:left="2148" w:hanging="360"/>
+      </w:pPr>
+      <w:rPr>
+        <w:rFonts w:ascii="Courier New" w:hAnsi="Courier New" w:cs="Courier New" w:hint="default"/>
+      </w:rPr>
+    </w:lvl>
+    <w:lvl w:ilvl="2" w:tplc="04160005" w:tentative="1">
+      <w:start w:val="1"/>
+      <w:numFmt w:val="bullet"/>
+      <w:lvlText w:val=""/>
+      <w:lvlJc w:val="left"/>
+      <w:pPr>
+        <w:ind w:left="2868" w:hanging="360"/>
+      </w:pPr>
+      <w:rPr>
+        <w:rFonts w:ascii="Wingdings" w:hAnsi="Wingdings" w:hint="default"/>
+      </w:rPr>
+    </w:lvl>
+    <w:lvl w:ilvl="3" w:tplc="04160001" w:tentative="1">
+      <w:start w:val="1"/>
+      <w:numFmt w:val="bullet"/>
+      <w:lvlText w:val=""/>
+      <w:lvlJc w:val="left"/>
+      <w:pPr>
+        <w:ind w:left="3588" w:hanging="360"/>
+      </w:pPr>
+      <w:rPr>
+        <w:rFonts w:ascii="Symbol" w:hAnsi="Symbol" w:hint="default"/>
+      </w:rPr>
+    </w:lvl>
+    <w:lvl w:ilvl="4" w:tplc="04160003" w:tentative="1">
+      <w:start w:val="1"/>
+      <w:numFmt w:val="bullet"/>
+      <w:lvlText w:val="o"/>
+      <w:lvlJc w:val="left"/>
+      <w:pPr>
+        <w:ind w:left="4308" w:hanging="360"/>
+      </w:pPr>
+      <w:rPr>
+        <w:rFonts w:ascii="Courier New" w:hAnsi="Courier New" w:cs="Courier New" w:hint="default"/>
+      </w:rPr>
+    </w:lvl>
+    <w:lvl w:ilvl="5" w:tplc="04160005" w:tentative="1">
+      <w:start w:val="1"/>
+      <w:numFmt w:val="bullet"/>
+      <w:lvlText w:val=""/>
+      <w:lvlJc w:val="left"/>
+      <w:pPr>
+        <w:ind w:left="5028" w:hanging="360"/>
+      </w:pPr>
+      <w:rPr>
+        <w:rFonts w:ascii="Wingdings" w:hAnsi="Wingdings" w:hint="default"/>
+      </w:rPr>
+    </w:lvl>
+    <w:lvl w:ilvl="6" w:tplc="04160001" w:tentative="1">
+      <w:start w:val="1"/>
+      <w:numFmt w:val="bullet"/>
+      <w:lvlText w:val=""/>
+      <w:lvlJc w:val="left"/>
+      <w:pPr>
+        <w:ind w:left="5748" w:hanging="360"/>
+      </w:pPr>
+      <w:rPr>
+        <w:rFonts w:ascii="Symbol" w:hAnsi="Symbol" w:hint="default"/>
+      </w:rPr>
+    </w:lvl>
+    <w:lvl w:ilvl="7" w:tplc="04160003" w:tentative="1">
+      <w:start w:val="1"/>
+      <w:numFmt w:val="bullet"/>
+      <w:lvlText w:val="o"/>
+      <w:lvlJc w:val="left"/>
+      <w:pPr>
+        <w:ind w:left="6468" w:hanging="360"/>
+      </w:pPr>
+      <w:rPr>
+        <w:rFonts w:ascii="Courier New" w:hAnsi="Courier New" w:cs="Courier New" w:hint="default"/>
+      </w:rPr>
+    </w:lvl>
+    <w:lvl w:ilvl="8" w:tplc="04160005" w:tentative="1">
+      <w:start w:val="1"/>
+      <w:numFmt w:val="bullet"/>
+      <w:lvlText w:val=""/>
+      <w:lvlJc w:val="left"/>
+      <w:pPr>
+        <w:ind w:left="7188" w:hanging="360"/>
+      </w:pPr>
+      <w:rPr>
+        <w:rFonts w:ascii="Wingdings" w:hAnsi="Wingdings" w:hint="default"/>
+      </w:rPr>
+    </w:lvl>
+  </w:abstractNum>
+  <w:abstractNum w:abstractNumId="4" w15:restartNumberingAfterBreak="0">
     <w:nsid w:val="2EAB0E39"/>
     <w:multiLevelType w:val="hybridMultilevel"/>
     <w:tmpl w:val="8DA696F4"/>
@@ -2919,7 +4277,120 @@
       </w:rPr>
     </w:lvl>
   </w:abstractNum>
-  <w:abstractNum w:abstractNumId="4" w15:restartNumberingAfterBreak="0">
+  <w:abstractNum w:abstractNumId="5" w15:restartNumberingAfterBreak="0">
+    <w:nsid w:val="3DBE54A0"/>
+    <w:multiLevelType w:val="hybridMultilevel"/>
+    <w:tmpl w:val="7C2AD470"/>
+    <w:lvl w:ilvl="0" w:tplc="04160001">
+      <w:start w:val="1"/>
+      <w:numFmt w:val="bullet"/>
+      <w:lvlText w:val=""/>
+      <w:lvlJc w:val="left"/>
+      <w:pPr>
+        <w:ind w:left="1440" w:hanging="360"/>
+      </w:pPr>
+      <w:rPr>
+        <w:rFonts w:ascii="Symbol" w:hAnsi="Symbol" w:hint="default"/>
+      </w:rPr>
+    </w:lvl>
+    <w:lvl w:ilvl="1" w:tplc="04160003">
+      <w:start w:val="1"/>
+      <w:numFmt w:val="bullet"/>
+      <w:lvlText w:val="o"/>
+      <w:lvlJc w:val="left"/>
+      <w:pPr>
+        <w:ind w:left="2160" w:hanging="360"/>
+      </w:pPr>
+      <w:rPr>
+        <w:rFonts w:ascii="Courier New" w:hAnsi="Courier New" w:cs="Courier New" w:hint="default"/>
+      </w:rPr>
+    </w:lvl>
+    <w:lvl w:ilvl="2" w:tplc="04160005" w:tentative="1">
+      <w:start w:val="1"/>
+      <w:numFmt w:val="bullet"/>
+      <w:lvlText w:val=""/>
+      <w:lvlJc w:val="left"/>
+      <w:pPr>
+        <w:ind w:left="2880" w:hanging="360"/>
+      </w:pPr>
+      <w:rPr>
+        <w:rFonts w:ascii="Wingdings" w:hAnsi="Wingdings" w:hint="default"/>
+      </w:rPr>
+    </w:lvl>
+    <w:lvl w:ilvl="3" w:tplc="04160001" w:tentative="1">
+      <w:start w:val="1"/>
+      <w:numFmt w:val="bullet"/>
+      <w:lvlText w:val=""/>
+      <w:lvlJc w:val="left"/>
+      <w:pPr>
+        <w:ind w:left="3600" w:hanging="360"/>
+      </w:pPr>
+      <w:rPr>
+        <w:rFonts w:ascii="Symbol" w:hAnsi="Symbol" w:hint="default"/>
+      </w:rPr>
+    </w:lvl>
+    <w:lvl w:ilvl="4" w:tplc="04160003" w:tentative="1">
+      <w:start w:val="1"/>
+      <w:numFmt w:val="bullet"/>
+      <w:lvlText w:val="o"/>
+      <w:lvlJc w:val="left"/>
+      <w:pPr>
+        <w:ind w:left="4320" w:hanging="360"/>
+      </w:pPr>
+      <w:rPr>
+        <w:rFonts w:ascii="Courier New" w:hAnsi="Courier New" w:cs="Courier New" w:hint="default"/>
+      </w:rPr>
+    </w:lvl>
+    <w:lvl w:ilvl="5" w:tplc="04160005" w:tentative="1">
+      <w:start w:val="1"/>
+      <w:numFmt w:val="bullet"/>
+      <w:lvlText w:val=""/>
+      <w:lvlJc w:val="left"/>
+      <w:pPr>
+        <w:ind w:left="5040" w:hanging="360"/>
+      </w:pPr>
+      <w:rPr>
+        <w:rFonts w:ascii="Wingdings" w:hAnsi="Wingdings" w:hint="default"/>
+      </w:rPr>
+    </w:lvl>
+    <w:lvl w:ilvl="6" w:tplc="04160001" w:tentative="1">
+      <w:start w:val="1"/>
+      <w:numFmt w:val="bullet"/>
+      <w:lvlText w:val=""/>
+      <w:lvlJc w:val="left"/>
+      <w:pPr>
+        <w:ind w:left="5760" w:hanging="360"/>
+      </w:pPr>
+      <w:rPr>
+        <w:rFonts w:ascii="Symbol" w:hAnsi="Symbol" w:hint="default"/>
+      </w:rPr>
+    </w:lvl>
+    <w:lvl w:ilvl="7" w:tplc="04160003" w:tentative="1">
+      <w:start w:val="1"/>
+      <w:numFmt w:val="bullet"/>
+      <w:lvlText w:val="o"/>
+      <w:lvlJc w:val="left"/>
+      <w:pPr>
+        <w:ind w:left="6480" w:hanging="360"/>
+      </w:pPr>
+      <w:rPr>
+        <w:rFonts w:ascii="Courier New" w:hAnsi="Courier New" w:cs="Courier New" w:hint="default"/>
+      </w:rPr>
+    </w:lvl>
+    <w:lvl w:ilvl="8" w:tplc="04160005" w:tentative="1">
+      <w:start w:val="1"/>
+      <w:numFmt w:val="bullet"/>
+      <w:lvlText w:val=""/>
+      <w:lvlJc w:val="left"/>
+      <w:pPr>
+        <w:ind w:left="7200" w:hanging="360"/>
+      </w:pPr>
+      <w:rPr>
+        <w:rFonts w:ascii="Wingdings" w:hAnsi="Wingdings" w:hint="default"/>
+      </w:rPr>
+    </w:lvl>
+  </w:abstractNum>
+  <w:abstractNum w:abstractNumId="6" w15:restartNumberingAfterBreak="0">
     <w:nsid w:val="51E15AF4"/>
     <w:multiLevelType w:val="hybridMultilevel"/>
     <w:tmpl w:val="4F9227D6"/>
@@ -3008,7 +4479,120 @@
       </w:pPr>
     </w:lvl>
   </w:abstractNum>
-  <w:abstractNum w:abstractNumId="5" w15:restartNumberingAfterBreak="0">
+  <w:abstractNum w:abstractNumId="7" w15:restartNumberingAfterBreak="0">
+    <w:nsid w:val="62A76B91"/>
+    <w:multiLevelType w:val="hybridMultilevel"/>
+    <w:tmpl w:val="0BC6313E"/>
+    <w:lvl w:ilvl="0" w:tplc="04160001">
+      <w:start w:val="1"/>
+      <w:numFmt w:val="bullet"/>
+      <w:lvlText w:val=""/>
+      <w:lvlJc w:val="left"/>
+      <w:pPr>
+        <w:ind w:left="1440" w:hanging="360"/>
+      </w:pPr>
+      <w:rPr>
+        <w:rFonts w:ascii="Symbol" w:hAnsi="Symbol" w:hint="default"/>
+      </w:rPr>
+    </w:lvl>
+    <w:lvl w:ilvl="1" w:tplc="04160003">
+      <w:start w:val="1"/>
+      <w:numFmt w:val="bullet"/>
+      <w:lvlText w:val="o"/>
+      <w:lvlJc w:val="left"/>
+      <w:pPr>
+        <w:ind w:left="2160" w:hanging="360"/>
+      </w:pPr>
+      <w:rPr>
+        <w:rFonts w:ascii="Courier New" w:hAnsi="Courier New" w:cs="Courier New" w:hint="default"/>
+      </w:rPr>
+    </w:lvl>
+    <w:lvl w:ilvl="2" w:tplc="04160005">
+      <w:start w:val="1"/>
+      <w:numFmt w:val="bullet"/>
+      <w:lvlText w:val=""/>
+      <w:lvlJc w:val="left"/>
+      <w:pPr>
+        <w:ind w:left="2880" w:hanging="360"/>
+      </w:pPr>
+      <w:rPr>
+        <w:rFonts w:ascii="Wingdings" w:hAnsi="Wingdings" w:hint="default"/>
+      </w:rPr>
+    </w:lvl>
+    <w:lvl w:ilvl="3" w:tplc="04160001" w:tentative="1">
+      <w:start w:val="1"/>
+      <w:numFmt w:val="bullet"/>
+      <w:lvlText w:val=""/>
+      <w:lvlJc w:val="left"/>
+      <w:pPr>
+        <w:ind w:left="3600" w:hanging="360"/>
+      </w:pPr>
+      <w:rPr>
+        <w:rFonts w:ascii="Symbol" w:hAnsi="Symbol" w:hint="default"/>
+      </w:rPr>
+    </w:lvl>
+    <w:lvl w:ilvl="4" w:tplc="04160003" w:tentative="1">
+      <w:start w:val="1"/>
+      <w:numFmt w:val="bullet"/>
+      <w:lvlText w:val="o"/>
+      <w:lvlJc w:val="left"/>
+      <w:pPr>
+        <w:ind w:left="4320" w:hanging="360"/>
+      </w:pPr>
+      <w:rPr>
+        <w:rFonts w:ascii="Courier New" w:hAnsi="Courier New" w:cs="Courier New" w:hint="default"/>
+      </w:rPr>
+    </w:lvl>
+    <w:lvl w:ilvl="5" w:tplc="04160005" w:tentative="1">
+      <w:start w:val="1"/>
+      <w:numFmt w:val="bullet"/>
+      <w:lvlText w:val=""/>
+      <w:lvlJc w:val="left"/>
+      <w:pPr>
+        <w:ind w:left="5040" w:hanging="360"/>
+      </w:pPr>
+      <w:rPr>
+        <w:rFonts w:ascii="Wingdings" w:hAnsi="Wingdings" w:hint="default"/>
+      </w:rPr>
+    </w:lvl>
+    <w:lvl w:ilvl="6" w:tplc="04160001" w:tentative="1">
+      <w:start w:val="1"/>
+      <w:numFmt w:val="bullet"/>
+      <w:lvlText w:val=""/>
+      <w:lvlJc w:val="left"/>
+      <w:pPr>
+        <w:ind w:left="5760" w:hanging="360"/>
+      </w:pPr>
+      <w:rPr>
+        <w:rFonts w:ascii="Symbol" w:hAnsi="Symbol" w:hint="default"/>
+      </w:rPr>
+    </w:lvl>
+    <w:lvl w:ilvl="7" w:tplc="04160003" w:tentative="1">
+      <w:start w:val="1"/>
+      <w:numFmt w:val="bullet"/>
+      <w:lvlText w:val="o"/>
+      <w:lvlJc w:val="left"/>
+      <w:pPr>
+        <w:ind w:left="6480" w:hanging="360"/>
+      </w:pPr>
+      <w:rPr>
+        <w:rFonts w:ascii="Courier New" w:hAnsi="Courier New" w:cs="Courier New" w:hint="default"/>
+      </w:rPr>
+    </w:lvl>
+    <w:lvl w:ilvl="8" w:tplc="04160005" w:tentative="1">
+      <w:start w:val="1"/>
+      <w:numFmt w:val="bullet"/>
+      <w:lvlText w:val=""/>
+      <w:lvlJc w:val="left"/>
+      <w:pPr>
+        <w:ind w:left="7200" w:hanging="360"/>
+      </w:pPr>
+      <w:rPr>
+        <w:rFonts w:ascii="Wingdings" w:hAnsi="Wingdings" w:hint="default"/>
+      </w:rPr>
+    </w:lvl>
+  </w:abstractNum>
+  <w:abstractNum w:abstractNumId="8" w15:restartNumberingAfterBreak="0">
     <w:nsid w:val="67B55BAF"/>
     <w:multiLevelType w:val="hybridMultilevel"/>
     <w:tmpl w:val="264C8048"/>
@@ -3121,7 +4705,7 @@
       </w:rPr>
     </w:lvl>
   </w:abstractNum>
-  <w:abstractNum w:abstractNumId="6" w15:restartNumberingAfterBreak="0">
+  <w:abstractNum w:abstractNumId="9" w15:restartNumberingAfterBreak="0">
     <w:nsid w:val="6D0B0D6A"/>
     <w:multiLevelType w:val="hybridMultilevel"/>
     <w:tmpl w:val="A5FEA078"/>
@@ -3207,7 +4791,7 @@
       </w:pPr>
     </w:lvl>
   </w:abstractNum>
-  <w:abstractNum w:abstractNumId="7" w15:restartNumberingAfterBreak="0">
+  <w:abstractNum w:abstractNumId="10" w15:restartNumberingAfterBreak="0">
     <w:nsid w:val="6D7027B1"/>
     <w:multiLevelType w:val="hybridMultilevel"/>
     <w:tmpl w:val="DD825240"/>
@@ -3293,7 +4877,7 @@
       </w:pPr>
     </w:lvl>
   </w:abstractNum>
-  <w:abstractNum w:abstractNumId="8" w15:restartNumberingAfterBreak="0">
+  <w:abstractNum w:abstractNumId="11" w15:restartNumberingAfterBreak="0">
     <w:nsid w:val="72306219"/>
     <w:multiLevelType w:val="hybridMultilevel"/>
     <w:tmpl w:val="176E5612"/>
@@ -3379,7 +4963,7 @@
       </w:pPr>
     </w:lvl>
   </w:abstractNum>
-  <w:abstractNum w:abstractNumId="9" w15:restartNumberingAfterBreak="0">
+  <w:abstractNum w:abstractNumId="12" w15:restartNumberingAfterBreak="0">
     <w:nsid w:val="7E7B0D1F"/>
     <w:multiLevelType w:val="hybridMultilevel"/>
     <w:tmpl w:val="176E5612"/>
@@ -3465,10 +5049,10 @@
       </w:pPr>
     </w:lvl>
   </w:abstractNum>
-  <w:abstractNum w:abstractNumId="10" w15:restartNumberingAfterBreak="0">
+  <w:abstractNum w:abstractNumId="13" w15:restartNumberingAfterBreak="0">
     <w:nsid w:val="7F0B2FBB"/>
     <w:multiLevelType w:val="hybridMultilevel"/>
-    <w:tmpl w:val="985A538C"/>
+    <w:tmpl w:val="2B609008"/>
     <w:lvl w:ilvl="0" w:tplc="0416000F">
       <w:start w:val="1"/>
       <w:numFmt w:val="decimal"/>
@@ -3555,34 +5139,43 @@
     <w:abstractNumId w:val="1"/>
   </w:num>
   <w:num w:numId="2" w16cid:durableId="1120993361">
+    <w:abstractNumId w:val="6"/>
+  </w:num>
+  <w:num w:numId="3" w16cid:durableId="1279413765">
+    <w:abstractNumId w:val="10"/>
+  </w:num>
+  <w:num w:numId="4" w16cid:durableId="883056355">
+    <w:abstractNumId w:val="11"/>
+  </w:num>
+  <w:num w:numId="5" w16cid:durableId="2128886449">
+    <w:abstractNumId w:val="12"/>
+  </w:num>
+  <w:num w:numId="6" w16cid:durableId="754977301">
+    <w:abstractNumId w:val="13"/>
+  </w:num>
+  <w:num w:numId="7" w16cid:durableId="1162739929">
     <w:abstractNumId w:val="4"/>
   </w:num>
-  <w:num w:numId="3" w16cid:durableId="1279413765">
-    <w:abstractNumId w:val="7"/>
-  </w:num>
-  <w:num w:numId="4" w16cid:durableId="883056355">
+  <w:num w:numId="8" w16cid:durableId="263728728">
     <w:abstractNumId w:val="8"/>
-  </w:num>
-  <w:num w:numId="5" w16cid:durableId="2128886449">
-    <w:abstractNumId w:val="9"/>
-  </w:num>
-  <w:num w:numId="6" w16cid:durableId="754977301">
-    <w:abstractNumId w:val="10"/>
-  </w:num>
-  <w:num w:numId="7" w16cid:durableId="1162739929">
-    <w:abstractNumId w:val="3"/>
-  </w:num>
-  <w:num w:numId="8" w16cid:durableId="263728728">
-    <w:abstractNumId w:val="5"/>
   </w:num>
   <w:num w:numId="9" w16cid:durableId="887952585">
     <w:abstractNumId w:val="0"/>
   </w:num>
   <w:num w:numId="10" w16cid:durableId="1624189436">
-    <w:abstractNumId w:val="6"/>
+    <w:abstractNumId w:val="9"/>
   </w:num>
   <w:num w:numId="11" w16cid:durableId="16086217">
     <w:abstractNumId w:val="2"/>
+  </w:num>
+  <w:num w:numId="12" w16cid:durableId="884831995">
+    <w:abstractNumId w:val="5"/>
+  </w:num>
+  <w:num w:numId="13" w16cid:durableId="1222134018">
+    <w:abstractNumId w:val="3"/>
+  </w:num>
+  <w:num w:numId="14" w16cid:durableId="874581591">
+    <w:abstractNumId w:val="7"/>
   </w:num>
 </w:numbering>
 </file>
@@ -4190,6 +5783,7 @@
   <w:style w:type="character" w:default="1" w:styleId="Fontepargpadro">
     <w:name w:val="Default Paragraph Font"/>
     <w:uiPriority w:val="1"/>
+    <w:semiHidden/>
     <w:unhideWhenUsed/>
   </w:style>
   <w:style w:type="table" w:default="1" w:styleId="Tabelanormal">

</xml_diff>